<commit_message>
poprawiłem setup i final analysis spss, żeby porpawnie renderował wykresy z funkcji render; zaktualizowałem reference docx
</commit_message>
<xml_diff>
--- a/inst/spss_project/materials/wzor4.docx
+++ b/inst/spss_project/materials/wzor4.docx
@@ -8,6 +8,20 @@
       </w:pPr>
       <w:r>
         <w:t>Wyniki</w:t>
+      </w:r>
+    </w:p>
+    <w:p>
+      <w:pPr>
+        <w:pStyle w:val="Heading1"/>
+      </w:pPr>
+      <w:r>
+        <w:t xml:space="preserve">Wyniki </w:t>
+      </w:r>
+      <w:r>
+        <w:t>heading</w:t>
+      </w:r>
+      <w:r>
+        <w:t xml:space="preserve"> 2</w:t>
       </w:r>
     </w:p>
     <w:p>
@@ -29,18 +43,23 @@
         <w:pStyle w:val="FirstParagraph"/>
       </w:pPr>
       <w:r>
-        <w:t>Wszystkie analizy zostały wykonane/zostały przeprowadzone/wykonano/przeprowadzono w programie statystycznym/za pomocą programu statystycznego/przy pomocy programu statystycznego IBM SPSS 25. Za próg istotności przyjęto p &lt; 0,05.</w:t>
+        <w:t>Wszystkie analizy zostały wykonane/zostały przeprowadzone/wy</w:t>
+      </w:r>
+      <w:bookmarkStart w:id="0" w:name="_GoBack"/>
+      <w:bookmarkEnd w:id="0"/>
+      <w:r>
+        <w:t>konano/przeprowadzono w programie statystycznym/za pomocą programu statystycznego/przy pomocy programu statystycznego IBM SPSS 25. Za próg istotności przyjęto p &lt; 0,05.</w:t>
       </w:r>
     </w:p>
     <w:p>
       <w:pPr>
         <w:pStyle w:val="Heading2"/>
       </w:pPr>
-      <w:bookmarkStart w:id="0" w:name="statystyki-opisowe"/>
+      <w:bookmarkStart w:id="1" w:name="statystyki-opisowe"/>
       <w:r>
         <w:t>Statystyki opisowe</w:t>
       </w:r>
-      <w:bookmarkEnd w:id="0"/>
+      <w:bookmarkEnd w:id="1"/>
     </w:p>
     <w:p>
       <w:pPr>
@@ -2653,6 +2672,7 @@
                 <w:rFonts w:ascii="Times" w:eastAsia="Times" w:hAnsi="Times" w:cs="Times"/>
                 <w:lang w:val="pl-PL"/>
               </w:rPr>
+              <w:lastRenderedPageBreak/>
               <w:t>Agresja w stosunku do otoczenia fizycznego</w:t>
             </w:r>
           </w:p>
@@ -3193,7 +3213,6 @@
               <w:rPr>
                 <w:rFonts w:ascii="Times" w:eastAsia="Times" w:hAnsi="Times" w:cs="Times"/>
               </w:rPr>
-              <w:lastRenderedPageBreak/>
               <w:t>Uporządkowane</w:t>
             </w:r>
           </w:p>
@@ -7738,11 +7757,11 @@
       <w:pPr>
         <w:pStyle w:val="Heading2"/>
       </w:pPr>
-      <w:bookmarkStart w:id="1" w:name="analizy-zależności"/>
+      <w:bookmarkStart w:id="2" w:name="analizy-zależności"/>
       <w:r>
         <w:t>Analizy zależności</w:t>
       </w:r>
-      <w:bookmarkEnd w:id="1"/>
+      <w:bookmarkEnd w:id="2"/>
     </w:p>
     <w:p>
       <w:pPr>
@@ -9655,12 +9674,10 @@
       <w:pPr>
         <w:pStyle w:val="TableCaption"/>
       </w:pPr>
-      <w:bookmarkStart w:id="2" w:name="_GoBack"/>
       <w:r>
         <w:t>Tabela 5. Ocena charakterystyki bohatera a rodzaj case’u - test Kruskal’a-Wallis’a</w:t>
       </w:r>
     </w:p>
-    <w:bookmarkEnd w:id="2"/>
     <w:tbl>
       <w:tblPr>
         <w:tblW w:w="0" w:type="auto"/>
@@ -17319,7 +17336,7 @@
   <w:abstractNum w:abstractNumId="0" w15:restartNumberingAfterBreak="0">
     <w:nsid w:val="FFFFFF7C"/>
     <w:multiLevelType w:val="singleLevel"/>
-    <w:tmpl w:val="B8D44D32"/>
+    <w:tmpl w:val="8AAEA4CA"/>
     <w:lvl w:ilvl="0">
       <w:start w:val="1"/>
       <w:numFmt w:val="decimal"/>
@@ -17336,7 +17353,7 @@
   <w:abstractNum w:abstractNumId="1" w15:restartNumberingAfterBreak="0">
     <w:nsid w:val="FFFFFF7D"/>
     <w:multiLevelType w:val="singleLevel"/>
-    <w:tmpl w:val="6DACD4B0"/>
+    <w:tmpl w:val="B7082D64"/>
     <w:lvl w:ilvl="0">
       <w:start w:val="1"/>
       <w:numFmt w:val="decimal"/>
@@ -17353,7 +17370,7 @@
   <w:abstractNum w:abstractNumId="2" w15:restartNumberingAfterBreak="0">
     <w:nsid w:val="FFFFFF7E"/>
     <w:multiLevelType w:val="singleLevel"/>
-    <w:tmpl w:val="3EC68992"/>
+    <w:tmpl w:val="821C05C0"/>
     <w:lvl w:ilvl="0">
       <w:start w:val="1"/>
       <w:numFmt w:val="decimal"/>
@@ -17370,7 +17387,7 @@
   <w:abstractNum w:abstractNumId="3" w15:restartNumberingAfterBreak="0">
     <w:nsid w:val="FFFFFF7F"/>
     <w:multiLevelType w:val="singleLevel"/>
-    <w:tmpl w:val="30C2E0A0"/>
+    <w:tmpl w:val="22E2B514"/>
     <w:lvl w:ilvl="0">
       <w:start w:val="1"/>
       <w:numFmt w:val="decimal"/>
@@ -17387,7 +17404,7 @@
   <w:abstractNum w:abstractNumId="4" w15:restartNumberingAfterBreak="0">
     <w:nsid w:val="FFFFFF80"/>
     <w:multiLevelType w:val="singleLevel"/>
-    <w:tmpl w:val="9BBC2496"/>
+    <w:tmpl w:val="F6D018B6"/>
     <w:lvl w:ilvl="0">
       <w:start w:val="1"/>
       <w:numFmt w:val="bullet"/>
@@ -17407,7 +17424,7 @@
   <w:abstractNum w:abstractNumId="5" w15:restartNumberingAfterBreak="0">
     <w:nsid w:val="FFFFFF81"/>
     <w:multiLevelType w:val="singleLevel"/>
-    <w:tmpl w:val="35009F28"/>
+    <w:tmpl w:val="DE1C63D4"/>
     <w:lvl w:ilvl="0">
       <w:start w:val="1"/>
       <w:numFmt w:val="bullet"/>
@@ -17427,7 +17444,7 @@
   <w:abstractNum w:abstractNumId="6" w15:restartNumberingAfterBreak="0">
     <w:nsid w:val="FFFFFF82"/>
     <w:multiLevelType w:val="singleLevel"/>
-    <w:tmpl w:val="59E6319C"/>
+    <w:tmpl w:val="7DF25450"/>
     <w:lvl w:ilvl="0">
       <w:start w:val="1"/>
       <w:numFmt w:val="bullet"/>
@@ -17447,7 +17464,7 @@
   <w:abstractNum w:abstractNumId="7" w15:restartNumberingAfterBreak="0">
     <w:nsid w:val="FFFFFF83"/>
     <w:multiLevelType w:val="singleLevel"/>
-    <w:tmpl w:val="CFE40250"/>
+    <w:tmpl w:val="738E8618"/>
     <w:lvl w:ilvl="0">
       <w:start w:val="1"/>
       <w:numFmt w:val="bullet"/>
@@ -17467,7 +17484,7 @@
   <w:abstractNum w:abstractNumId="8" w15:restartNumberingAfterBreak="0">
     <w:nsid w:val="FFFFFF88"/>
     <w:multiLevelType w:val="singleLevel"/>
-    <w:tmpl w:val="28A6CE2E"/>
+    <w:tmpl w:val="CE1EF720"/>
     <w:lvl w:ilvl="0">
       <w:start w:val="1"/>
       <w:numFmt w:val="decimal"/>
@@ -17484,7 +17501,7 @@
   <w:abstractNum w:abstractNumId="9" w15:restartNumberingAfterBreak="0">
     <w:nsid w:val="FFFFFF89"/>
     <w:multiLevelType w:val="singleLevel"/>
-    <w:tmpl w:val="B9B289FC"/>
+    <w:tmpl w:val="C102E6C2"/>
     <w:lvl w:ilvl="0">
       <w:start w:val="1"/>
       <w:numFmt w:val="bullet"/>
@@ -18030,19 +18047,22 @@
     <w:next w:val="BodyText"/>
     <w:uiPriority w:val="9"/>
     <w:qFormat/>
+    <w:rsid w:val="00981810"/>
     <w:pPr>
       <w:keepNext/>
       <w:keepLines/>
       <w:spacing w:before="480" w:after="0"/>
+      <w:ind w:left="0" w:right="0"/>
       <w:outlineLvl w:val="0"/>
     </w:pPr>
     <w:rPr>
-      <w:rFonts w:asciiTheme="majorHAnsi" w:eastAsiaTheme="majorEastAsia" w:hAnsiTheme="majorHAnsi" w:cstheme="majorBidi"/>
+      <w:rFonts w:eastAsiaTheme="majorEastAsia" w:cstheme="majorBidi"/>
       <w:b/>
       <w:bCs/>
-      <w:color w:val="345A8A" w:themeColor="accent1" w:themeShade="B5"/>
+      <w:color w:val="000000" w:themeColor="text1"/>
       <w:sz w:val="32"/>
       <w:szCs w:val="32"/>
+      <w:lang w:val="pl-PL"/>
     </w:rPr>
   </w:style>
   <w:style w:type="paragraph" w:styleId="Heading2">

</xml_diff>